<commit_message>
Use new template options
</commit_message>
<xml_diff>
--- a/docs/ms.docx
+++ b/docs/ms.docx
@@ -7,25 +7,7 @@
         <w:pStyle w:val="Title"/>
       </w:pPr>
       <w:r>
-        <w:t xml:space="preserve">Communicating</w:t>
-      </w:r>
-      <w:r>
-        <w:t xml:space="preserve"> </w:t>
-      </w:r>
-      <w:r>
-        <w:t xml:space="preserve">causal</w:t>
-      </w:r>
-      <w:r>
-        <w:t xml:space="preserve"> </w:t>
-      </w:r>
-      <w:r>
-        <w:t xml:space="preserve">effect</w:t>
-      </w:r>
-      <w:r>
-        <w:t xml:space="preserve"> </w:t>
-      </w:r>
-      <w:r>
-        <w:t xml:space="preserve">heterogeneity</w:t>
+        <w:t xml:space="preserve">Communicating causal effect heterogeneity</w:t>
       </w:r>
     </w:p>
     <w:p>
@@ -33,13 +15,7 @@
         <w:pStyle w:val="Author"/>
       </w:pPr>
       <w:r>
-        <w:t xml:space="preserve">Matti</w:t>
-      </w:r>
-      <w:r>
-        <w:t xml:space="preserve"> </w:t>
-      </w:r>
-      <w:r>
-        <w:t xml:space="preserve">Vuorre</w:t>
+        <w:t xml:space="preserve">Matti Vuorre</w:t>
       </w:r>
     </w:p>
     <w:p>
@@ -47,13 +23,7 @@
         <w:pStyle w:val="Author"/>
       </w:pPr>
       <w:r>
-        <w:t xml:space="preserve">Matthew</w:t>
-      </w:r>
-      <w:r>
-        <w:t xml:space="preserve"> </w:t>
-      </w:r>
-      <w:r>
-        <w:t xml:space="preserve">Kay</w:t>
+        <w:t xml:space="preserve">Matthew Kay</w:t>
       </w:r>
     </w:p>
     <w:p>
@@ -61,13 +31,7 @@
         <w:pStyle w:val="Author"/>
       </w:pPr>
       <w:r>
-        <w:t xml:space="preserve">Niall</w:t>
-      </w:r>
-      <w:r>
-        <w:t xml:space="preserve"> </w:t>
-      </w:r>
-      <w:r>
-        <w:t xml:space="preserve">Bolger</w:t>
+        <w:t xml:space="preserve">Niall Bolger</w:t>
       </w:r>
     </w:p>
     <w:p>
@@ -83,1036 +47,16 @@
         <w:pStyle w:val="Abstract"/>
       </w:pPr>
       <w:r>
-        <w:t xml:space="preserve">Advances</w:t>
-      </w:r>
-      <w:r>
-        <w:t xml:space="preserve"> </w:t>
-      </w:r>
-      <w:r>
-        <w:t xml:space="preserve">in</w:t>
-      </w:r>
-      <w:r>
-        <w:t xml:space="preserve"> </w:t>
-      </w:r>
-      <w:r>
-        <w:t xml:space="preserve">experimental,</w:t>
-      </w:r>
-      <w:r>
-        <w:t xml:space="preserve"> </w:t>
-      </w:r>
-      <w:r>
-        <w:t xml:space="preserve">data</w:t>
-      </w:r>
-      <w:r>
-        <w:t xml:space="preserve"> </w:t>
-      </w:r>
-      <w:r>
-        <w:t xml:space="preserve">collection,</w:t>
-      </w:r>
-      <w:r>
-        <w:t xml:space="preserve"> </w:t>
-      </w:r>
-      <w:r>
-        <w:t xml:space="preserve">and</w:t>
-      </w:r>
-      <w:r>
-        <w:t xml:space="preserve"> </w:t>
-      </w:r>
-      <w:r>
-        <w:t xml:space="preserve">analysis</w:t>
-      </w:r>
-      <w:r>
-        <w:t xml:space="preserve"> </w:t>
-      </w:r>
-      <w:r>
-        <w:t xml:space="preserve">methods</w:t>
-      </w:r>
-      <w:r>
-        <w:t xml:space="preserve"> </w:t>
-      </w:r>
-      <w:r>
-        <w:t xml:space="preserve">have</w:t>
-      </w:r>
-      <w:r>
-        <w:t xml:space="preserve"> </w:t>
-      </w:r>
-      <w:r>
-        <w:t xml:space="preserve">brought</w:t>
-      </w:r>
-      <w:r>
-        <w:t xml:space="preserve"> </w:t>
-      </w:r>
-      <w:r>
-        <w:t xml:space="preserve">population</w:t>
-      </w:r>
-      <w:r>
-        <w:t xml:space="preserve"> </w:t>
-      </w:r>
-      <w:r>
-        <w:t xml:space="preserve">variability</w:t>
-      </w:r>
-      <w:r>
-        <w:t xml:space="preserve"> </w:t>
-      </w:r>
-      <w:r>
-        <w:t xml:space="preserve">in</w:t>
-      </w:r>
-      <w:r>
-        <w:t xml:space="preserve"> </w:t>
-      </w:r>
-      <w:r>
-        <w:t xml:space="preserve">psychological</w:t>
-      </w:r>
-      <w:r>
-        <w:t xml:space="preserve"> </w:t>
-      </w:r>
-      <w:r>
-        <w:t xml:space="preserve">phenomena</w:t>
-      </w:r>
-      <w:r>
-        <w:t xml:space="preserve"> </w:t>
-      </w:r>
-      <w:r>
-        <w:t xml:space="preserve">to</w:t>
-      </w:r>
-      <w:r>
-        <w:t xml:space="preserve"> </w:t>
-      </w:r>
-      <w:r>
-        <w:t xml:space="preserve">the</w:t>
-      </w:r>
-      <w:r>
-        <w:t xml:space="preserve"> </w:t>
-      </w:r>
-      <w:r>
-        <w:t xml:space="preserve">fore.</w:t>
-      </w:r>
-      <w:r>
-        <w:t xml:space="preserve"> </w:t>
-      </w:r>
-      <w:r>
-        <w:t xml:space="preserve">Yet,</w:t>
-      </w:r>
-      <w:r>
-        <w:t xml:space="preserve"> </w:t>
-      </w:r>
-      <w:r>
-        <w:t xml:space="preserve">current</w:t>
-      </w:r>
-      <w:r>
-        <w:t xml:space="preserve"> </w:t>
-      </w:r>
-      <w:r>
-        <w:t xml:space="preserve">practices</w:t>
-      </w:r>
-      <w:r>
-        <w:t xml:space="preserve"> </w:t>
-      </w:r>
-      <w:r>
-        <w:t xml:space="preserve">for</w:t>
-      </w:r>
-      <w:r>
-        <w:t xml:space="preserve"> </w:t>
-      </w:r>
-      <w:r>
-        <w:t xml:space="preserve">interpreting</w:t>
-      </w:r>
-      <w:r>
-        <w:t xml:space="preserve"> </w:t>
-      </w:r>
-      <w:r>
-        <w:t xml:space="preserve">such</w:t>
-      </w:r>
-      <w:r>
-        <w:t xml:space="preserve"> </w:t>
-      </w:r>
-      <w:r>
-        <w:t xml:space="preserve">heterogeneity</w:t>
-      </w:r>
-      <w:r>
-        <w:t xml:space="preserve"> </w:t>
-      </w:r>
-      <w:r>
-        <w:t xml:space="preserve">do</w:t>
-      </w:r>
-      <w:r>
-        <w:t xml:space="preserve"> </w:t>
-      </w:r>
-      <w:r>
-        <w:t xml:space="preserve">not</w:t>
-      </w:r>
-      <w:r>
-        <w:t xml:space="preserve"> </w:t>
-      </w:r>
-      <w:r>
-        <w:t xml:space="preserve">appropriately</w:t>
-      </w:r>
-      <w:r>
-        <w:t xml:space="preserve"> </w:t>
-      </w:r>
-      <w:r>
-        <w:t xml:space="preserve">treat</w:t>
-      </w:r>
-      <w:r>
-        <w:t xml:space="preserve"> </w:t>
-      </w:r>
-      <w:r>
-        <w:t xml:space="preserve">the</w:t>
-      </w:r>
-      <w:r>
-        <w:t xml:space="preserve"> </w:t>
-      </w:r>
-      <w:r>
-        <w:t xml:space="preserve">uncertainty</w:t>
-      </w:r>
-      <w:r>
-        <w:t xml:space="preserve"> </w:t>
-      </w:r>
-      <w:r>
-        <w:t xml:space="preserve">inevitable</w:t>
-      </w:r>
-      <w:r>
-        <w:t xml:space="preserve"> </w:t>
-      </w:r>
-      <w:r>
-        <w:t xml:space="preserve">in</w:t>
-      </w:r>
-      <w:r>
-        <w:t xml:space="preserve"> </w:t>
-      </w:r>
-      <w:r>
-        <w:t xml:space="preserve">any</w:t>
-      </w:r>
-      <w:r>
-        <w:t xml:space="preserve"> </w:t>
-      </w:r>
-      <w:r>
-        <w:t xml:space="preserve">statistical</w:t>
-      </w:r>
-      <w:r>
-        <w:t xml:space="preserve"> </w:t>
-      </w:r>
-      <w:r>
-        <w:t xml:space="preserve">summary.</w:t>
-      </w:r>
-      <w:r>
-        <w:t xml:space="preserve"> </w:t>
-      </w:r>
-      <w:r>
-        <w:t xml:space="preserve">Heterogeneity</w:t>
-      </w:r>
-      <w:r>
-        <w:t xml:space="preserve"> </w:t>
-      </w:r>
-      <w:r>
-        <w:t xml:space="preserve">is</w:t>
-      </w:r>
-      <w:r>
-        <w:t xml:space="preserve"> </w:t>
-      </w:r>
-      <w:r>
-        <w:t xml:space="preserve">best</w:t>
-      </w:r>
-      <w:r>
-        <w:t xml:space="preserve"> </w:t>
-      </w:r>
-      <w:r>
-        <w:t xml:space="preserve">thought</w:t>
-      </w:r>
-      <w:r>
-        <w:t xml:space="preserve"> </w:t>
-      </w:r>
-      <w:r>
-        <w:t xml:space="preserve">of</w:t>
-      </w:r>
-      <w:r>
-        <w:t xml:space="preserve"> </w:t>
-      </w:r>
-      <w:r>
-        <w:t xml:space="preserve">as</w:t>
-      </w:r>
-      <w:r>
-        <w:t xml:space="preserve"> </w:t>
-      </w:r>
-      <w:r>
-        <w:t xml:space="preserve">a</w:t>
-      </w:r>
-      <w:r>
-        <w:t xml:space="preserve"> </w:t>
-      </w:r>
-      <w:r>
-        <w:t xml:space="preserve">distribution</w:t>
-      </w:r>
-      <w:r>
-        <w:t xml:space="preserve"> </w:t>
-      </w:r>
-      <w:r>
-        <w:t xml:space="preserve">of</w:t>
-      </w:r>
-      <w:r>
-        <w:t xml:space="preserve"> </w:t>
-      </w:r>
-      <w:r>
-        <w:t xml:space="preserve">features</w:t>
-      </w:r>
-      <w:r>
-        <w:t xml:space="preserve"> </w:t>
-      </w:r>
-      <w:r>
-        <w:t xml:space="preserve">with</w:t>
-      </w:r>
-      <w:r>
-        <w:t xml:space="preserve"> </w:t>
-      </w:r>
-      <w:r>
-        <w:t xml:space="preserve">a</w:t>
-      </w:r>
-      <w:r>
-        <w:t xml:space="preserve"> </w:t>
-      </w:r>
-      <w:r>
-        <w:t xml:space="preserve">mean</w:t>
-      </w:r>
-      <w:r>
-        <w:t xml:space="preserve"> </w:t>
-      </w:r>
-      <w:r>
-        <w:t xml:space="preserve">(average</w:t>
-      </w:r>
-      <w:r>
-        <w:t xml:space="preserve"> </w:t>
-      </w:r>
-      <w:r>
-        <w:t xml:space="preserve">person’s</w:t>
-      </w:r>
-      <w:r>
-        <w:t xml:space="preserve"> </w:t>
-      </w:r>
-      <w:r>
-        <w:t xml:space="preserve">effect)</w:t>
-      </w:r>
-      <w:r>
-        <w:t xml:space="preserve"> </w:t>
-      </w:r>
-      <w:r>
-        <w:t xml:space="preserve">and</w:t>
-      </w:r>
-      <w:r>
-        <w:t xml:space="preserve"> </w:t>
-      </w:r>
-      <w:r>
-        <w:t xml:space="preserve">variance</w:t>
-      </w:r>
-      <w:r>
-        <w:t xml:space="preserve"> </w:t>
-      </w:r>
-      <w:r>
-        <w:t xml:space="preserve">(between-person</w:t>
-      </w:r>
-      <w:r>
-        <w:t xml:space="preserve"> </w:t>
-      </w:r>
-      <w:r>
-        <w:t xml:space="preserve">differences).</w:t>
-      </w:r>
-      <w:r>
-        <w:t xml:space="preserve"> </w:t>
-      </w:r>
-      <w:r>
-        <w:t xml:space="preserve">This</w:t>
-      </w:r>
-      <w:r>
-        <w:t xml:space="preserve"> </w:t>
-      </w:r>
-      <w:r>
-        <w:t xml:space="preserve">expected</w:t>
-      </w:r>
-      <w:r>
-        <w:t xml:space="preserve"> </w:t>
-      </w:r>
-      <w:r>
-        <w:t xml:space="preserve">heterogeneity</w:t>
-      </w:r>
-      <w:r>
-        <w:t xml:space="preserve"> </w:t>
-      </w:r>
-      <w:r>
-        <w:t xml:space="preserve">distribution</w:t>
-      </w:r>
-      <w:r>
-        <w:t xml:space="preserve"> </w:t>
-      </w:r>
-      <w:r>
-        <w:t xml:space="preserve">can</w:t>
-      </w:r>
-      <w:r>
-        <w:t xml:space="preserve"> </w:t>
-      </w:r>
-      <w:r>
-        <w:t xml:space="preserve">be</w:t>
-      </w:r>
-      <w:r>
-        <w:t xml:space="preserve"> </w:t>
-      </w:r>
-      <w:r>
-        <w:t xml:space="preserve">further</w:t>
-      </w:r>
-      <w:r>
-        <w:t xml:space="preserve"> </w:t>
-      </w:r>
-      <w:r>
-        <w:t xml:space="preserve">summarized</w:t>
-      </w:r>
-      <w:r>
-        <w:t xml:space="preserve"> </w:t>
-      </w:r>
-      <w:r>
-        <w:t xml:space="preserve">e.g. as</w:t>
-      </w:r>
-      <w:r>
-        <w:t xml:space="preserve"> </w:t>
-      </w:r>
-      <w:r>
-        <w:t xml:space="preserve">a</w:t>
-      </w:r>
-      <w:r>
-        <w:t xml:space="preserve"> </w:t>
-      </w:r>
-      <w:r>
-        <w:t xml:space="preserve">heterogeneity</w:t>
-      </w:r>
-      <w:r>
-        <w:t xml:space="preserve"> </w:t>
-      </w:r>
-      <w:r>
-        <w:t xml:space="preserve">interval</w:t>
-      </w:r>
-      <w:r>
-        <w:t xml:space="preserve"> </w:t>
-      </w:r>
-      <w:r>
-        <w:t xml:space="preserve">(Bolger</w:t>
-      </w:r>
-      <w:r>
-        <w:t xml:space="preserve"> </w:t>
-      </w:r>
-      <w:r>
-        <w:t xml:space="preserve">et</w:t>
-      </w:r>
-      <w:r>
-        <w:t xml:space="preserve"> </w:t>
-      </w:r>
-      <w:r>
-        <w:t xml:space="preserve">al.,</w:t>
-      </w:r>
-      <w:r>
-        <w:t xml:space="preserve"> </w:t>
-      </w:r>
-      <w:r>
-        <w:t xml:space="preserve">2019)</w:t>
-      </w:r>
-      <w:r>
-        <w:t xml:space="preserve">.</w:t>
-      </w:r>
-      <w:r>
-        <w:t xml:space="preserve"> </w:t>
-      </w:r>
-      <w:r>
-        <w:t xml:space="preserve">However,</w:t>
-      </w:r>
-      <w:r>
-        <w:t xml:space="preserve"> </w:t>
-      </w:r>
-      <w:r>
-        <w:t xml:space="preserve">because</w:t>
-      </w:r>
-      <w:r>
-        <w:t xml:space="preserve"> </w:t>
-      </w:r>
-      <w:r>
-        <w:t xml:space="preserve">empirical</w:t>
-      </w:r>
-      <w:r>
-        <w:t xml:space="preserve"> </w:t>
-      </w:r>
-      <w:r>
-        <w:t xml:space="preserve">studies</w:t>
-      </w:r>
-      <w:r>
-        <w:t xml:space="preserve"> </w:t>
-      </w:r>
-      <w:r>
-        <w:t xml:space="preserve">estimate</w:t>
-      </w:r>
-      <w:r>
-        <w:t xml:space="preserve"> </w:t>
-      </w:r>
-      <w:r>
-        <w:t xml:space="preserve">the</w:t>
-      </w:r>
-      <w:r>
-        <w:t xml:space="preserve"> </w:t>
-      </w:r>
-      <w:r>
-        <w:t xml:space="preserve">underlying</w:t>
-      </w:r>
-      <w:r>
-        <w:t xml:space="preserve"> </w:t>
-      </w:r>
-      <w:r>
-        <w:t xml:space="preserve">mean</w:t>
-      </w:r>
-      <w:r>
-        <w:t xml:space="preserve"> </w:t>
-      </w:r>
-      <w:r>
-        <w:t xml:space="preserve">and</w:t>
-      </w:r>
-      <w:r>
-        <w:t xml:space="preserve"> </w:t>
-      </w:r>
-      <w:r>
-        <w:t xml:space="preserve">variance</w:t>
-      </w:r>
-      <w:r>
-        <w:t xml:space="preserve"> </w:t>
-      </w:r>
-      <w:r>
-        <w:t xml:space="preserve">parameters</w:t>
-      </w:r>
-      <w:r>
-        <w:t xml:space="preserve"> </w:t>
-      </w:r>
-      <w:r>
-        <w:t xml:space="preserve">with</w:t>
-      </w:r>
-      <w:r>
-        <w:t xml:space="preserve"> </w:t>
-      </w:r>
-      <w:r>
-        <w:t xml:space="preserve">uncertainty,</w:t>
-      </w:r>
-      <w:r>
-        <w:t xml:space="preserve"> </w:t>
-      </w:r>
-      <w:r>
-        <w:t xml:space="preserve">the</w:t>
-      </w:r>
-      <w:r>
-        <w:t xml:space="preserve"> </w:t>
-      </w:r>
-      <w:r>
-        <w:t xml:space="preserve">expected</w:t>
-      </w:r>
-      <w:r>
-        <w:t xml:space="preserve"> </w:t>
-      </w:r>
-      <w:r>
-        <w:t xml:space="preserve">distribution</w:t>
-      </w:r>
-      <w:r>
-        <w:t xml:space="preserve"> </w:t>
-      </w:r>
-      <w:r>
-        <w:t xml:space="preserve">and</w:t>
-      </w:r>
-      <w:r>
-        <w:t xml:space="preserve"> </w:t>
-      </w:r>
-      <w:r>
-        <w:t xml:space="preserve">interval</w:t>
-      </w:r>
-      <w:r>
-        <w:t xml:space="preserve"> </w:t>
-      </w:r>
-      <w:r>
-        <w:t xml:space="preserve">will</w:t>
-      </w:r>
-      <w:r>
-        <w:t xml:space="preserve"> </w:t>
-      </w:r>
-      <w:r>
-        <w:t xml:space="preserve">underestimate</w:t>
-      </w:r>
-      <w:r>
-        <w:t xml:space="preserve"> </w:t>
-      </w:r>
-      <w:r>
-        <w:t xml:space="preserve">the</w:t>
-      </w:r>
-      <w:r>
-        <w:t xml:space="preserve"> </w:t>
-      </w:r>
-      <w:r>
-        <w:t xml:space="preserve">actual</w:t>
-      </w:r>
-      <w:r>
-        <w:t xml:space="preserve"> </w:t>
-      </w:r>
-      <w:r>
-        <w:t xml:space="preserve">range</w:t>
-      </w:r>
-      <w:r>
-        <w:t xml:space="preserve"> </w:t>
-      </w:r>
-      <w:r>
-        <w:t xml:space="preserve">of</w:t>
-      </w:r>
-      <w:r>
-        <w:t xml:space="preserve"> </w:t>
-      </w:r>
-      <w:r>
-        <w:t xml:space="preserve">plausible</w:t>
-      </w:r>
-      <w:r>
-        <w:t xml:space="preserve"> </w:t>
-      </w:r>
-      <w:r>
-        <w:t xml:space="preserve">effects</w:t>
-      </w:r>
-      <w:r>
-        <w:t xml:space="preserve"> </w:t>
-      </w:r>
-      <w:r>
-        <w:t xml:space="preserve">in</w:t>
-      </w:r>
-      <w:r>
-        <w:t xml:space="preserve"> </w:t>
-      </w:r>
-      <w:r>
-        <w:t xml:space="preserve">the</w:t>
-      </w:r>
-      <w:r>
-        <w:t xml:space="preserve"> </w:t>
-      </w:r>
-      <w:r>
-        <w:t xml:space="preserve">population.</w:t>
-      </w:r>
-      <w:r>
-        <w:t xml:space="preserve"> </w:t>
-      </w:r>
-      <w:r>
-        <w:t xml:space="preserve">Using</w:t>
-      </w:r>
-      <w:r>
-        <w:t xml:space="preserve"> </w:t>
-      </w:r>
-      <w:r>
-        <w:t xml:space="preserve">Bayesian</w:t>
-      </w:r>
-      <w:r>
-        <w:t xml:space="preserve"> </w:t>
-      </w:r>
-      <w:r>
-        <w:t xml:space="preserve">hierarchical</w:t>
-      </w:r>
-      <w:r>
-        <w:t xml:space="preserve"> </w:t>
-      </w:r>
-      <w:r>
-        <w:t xml:space="preserve">models,</w:t>
-      </w:r>
-      <w:r>
-        <w:t xml:space="preserve"> </w:t>
-      </w:r>
-      <w:r>
-        <w:t xml:space="preserve">and</w:t>
-      </w:r>
-      <w:r>
-        <w:t xml:space="preserve"> </w:t>
-      </w:r>
-      <w:r>
-        <w:t xml:space="preserve">with</w:t>
-      </w:r>
-      <w:r>
-        <w:t xml:space="preserve"> </w:t>
-      </w:r>
-      <w:r>
-        <w:t xml:space="preserve">the</w:t>
-      </w:r>
-      <w:r>
-        <w:t xml:space="preserve"> </w:t>
-      </w:r>
-      <w:r>
-        <w:t xml:space="preserve">aid</w:t>
-      </w:r>
-      <w:r>
-        <w:t xml:space="preserve"> </w:t>
-      </w:r>
-      <w:r>
-        <w:t xml:space="preserve">of</w:t>
-      </w:r>
-      <w:r>
-        <w:t xml:space="preserve"> </w:t>
-      </w:r>
-      <w:r>
-        <w:t xml:space="preserve">empirical</w:t>
-      </w:r>
-      <w:r>
-        <w:t xml:space="preserve"> </w:t>
-      </w:r>
-      <w:r>
-        <w:t xml:space="preserve">datasets</w:t>
-      </w:r>
-      <w:r>
-        <w:t xml:space="preserve"> </w:t>
-      </w:r>
-      <w:r>
-        <w:t xml:space="preserve">from</w:t>
-      </w:r>
-      <w:r>
-        <w:t xml:space="preserve"> </w:t>
-      </w:r>
-      <w:r>
-        <w:t xml:space="preserve">social</w:t>
-      </w:r>
-      <w:r>
-        <w:t xml:space="preserve"> </w:t>
-      </w:r>
-      <w:r>
-        <w:t xml:space="preserve">and</w:t>
-      </w:r>
-      <w:r>
-        <w:t xml:space="preserve"> </w:t>
-      </w:r>
-      <w:r>
-        <w:t xml:space="preserve">cognitive</w:t>
-      </w:r>
-      <w:r>
-        <w:t xml:space="preserve"> </w:t>
-      </w:r>
-      <w:r>
-        <w:t xml:space="preserve">psychology,</w:t>
-      </w:r>
-      <w:r>
-        <w:t xml:space="preserve"> </w:t>
-      </w:r>
-      <w:r>
-        <w:t xml:space="preserve">we</w:t>
-      </w:r>
-      <w:r>
-        <w:t xml:space="preserve"> </w:t>
-      </w:r>
-      <w:r>
-        <w:t xml:space="preserve">provide</w:t>
-      </w:r>
-      <w:r>
-        <w:t xml:space="preserve"> </w:t>
-      </w:r>
-      <w:r>
-        <w:t xml:space="preserve">a</w:t>
-      </w:r>
-      <w:r>
-        <w:t xml:space="preserve"> </w:t>
-      </w:r>
-      <w:r>
-        <w:t xml:space="preserve">walk-through</w:t>
-      </w:r>
-      <w:r>
-        <w:t xml:space="preserve"> </w:t>
-      </w:r>
-      <w:r>
-        <w:t xml:space="preserve">of</w:t>
-      </w:r>
-      <w:r>
-        <w:t xml:space="preserve"> </w:t>
-      </w:r>
-      <w:r>
-        <w:t xml:space="preserve">effective</w:t>
-      </w:r>
-      <w:r>
-        <w:t xml:space="preserve"> </w:t>
-      </w:r>
-      <w:r>
-        <w:t xml:space="preserve">heterogeneity</w:t>
-      </w:r>
-      <w:r>
-        <w:t xml:space="preserve"> </w:t>
-      </w:r>
-      <w:r>
-        <w:t xml:space="preserve">reporting</w:t>
-      </w:r>
-      <w:r>
-        <w:t xml:space="preserve"> </w:t>
-      </w:r>
-      <w:r>
-        <w:t xml:space="preserve">and</w:t>
-      </w:r>
-      <w:r>
-        <w:t xml:space="preserve"> </w:t>
-      </w:r>
-      <w:r>
-        <w:t xml:space="preserve">display</w:t>
-      </w:r>
-      <w:r>
-        <w:t xml:space="preserve"> </w:t>
-      </w:r>
-      <w:r>
-        <w:t xml:space="preserve">tools</w:t>
-      </w:r>
-      <w:r>
-        <w:t xml:space="preserve"> </w:t>
-      </w:r>
-      <w:r>
-        <w:t xml:space="preserve">that</w:t>
-      </w:r>
-      <w:r>
-        <w:t xml:space="preserve"> </w:t>
-      </w:r>
-      <w:r>
-        <w:t xml:space="preserve">appropriately</w:t>
-      </w:r>
-      <w:r>
-        <w:t xml:space="preserve"> </w:t>
-      </w:r>
-      <w:r>
-        <w:t xml:space="preserve">convey</w:t>
-      </w:r>
-      <w:r>
-        <w:t xml:space="preserve"> </w:t>
-      </w:r>
-      <w:r>
-        <w:t xml:space="preserve">measures</w:t>
-      </w:r>
-      <w:r>
-        <w:t xml:space="preserve"> </w:t>
-      </w:r>
-      <w:r>
-        <w:t xml:space="preserve">of</w:t>
-      </w:r>
-      <w:r>
-        <w:t xml:space="preserve"> </w:t>
-      </w:r>
-      <w:r>
-        <w:t xml:space="preserve">uncertainty.</w:t>
-      </w:r>
-      <w:r>
-        <w:t xml:space="preserve"> </w:t>
-      </w:r>
-      <w:r>
-        <w:t xml:space="preserve">We</w:t>
-      </w:r>
-      <w:r>
-        <w:t xml:space="preserve"> </w:t>
-      </w:r>
-      <w:r>
-        <w:t xml:space="preserve">cover</w:t>
-      </w:r>
-      <w:r>
-        <w:t xml:space="preserve"> </w:t>
-      </w:r>
-      <w:r>
-        <w:t xml:space="preserve">interval,</w:t>
-      </w:r>
-      <w:r>
-        <w:t xml:space="preserve"> </w:t>
-      </w:r>
-      <w:r>
-        <w:t xml:space="preserve">proportion,</w:t>
-      </w:r>
-      <w:r>
-        <w:t xml:space="preserve"> </w:t>
-      </w:r>
-      <w:r>
-        <w:t xml:space="preserve">and</w:t>
-      </w:r>
-      <w:r>
-        <w:t xml:space="preserve"> </w:t>
-      </w:r>
-      <w:r>
-        <w:t xml:space="preserve">ratio</w:t>
-      </w:r>
-      <w:r>
-        <w:t xml:space="preserve"> </w:t>
-      </w:r>
-      <w:r>
-        <w:t xml:space="preserve">measures</w:t>
-      </w:r>
-      <w:r>
-        <w:t xml:space="preserve"> </w:t>
-      </w:r>
-      <w:r>
-        <w:t xml:space="preserve">of</w:t>
-      </w:r>
-      <w:r>
-        <w:t xml:space="preserve"> </w:t>
-      </w:r>
-      <w:r>
-        <w:t xml:space="preserve">heterogeneity</w:t>
-      </w:r>
-      <w:r>
-        <w:t xml:space="preserve"> </w:t>
-      </w:r>
-      <w:r>
-        <w:t xml:space="preserve">and</w:t>
-      </w:r>
-      <w:r>
-        <w:t xml:space="preserve"> </w:t>
-      </w:r>
-      <w:r>
-        <w:t xml:space="preserve">their</w:t>
-      </w:r>
-      <w:r>
-        <w:t xml:space="preserve"> </w:t>
-      </w:r>
-      <w:r>
-        <w:t xml:space="preserve">estimation</w:t>
-      </w:r>
-      <w:r>
-        <w:t xml:space="preserve"> </w:t>
-      </w:r>
-      <w:r>
-        <w:t xml:space="preserve">and</w:t>
-      </w:r>
-      <w:r>
-        <w:t xml:space="preserve"> </w:t>
-      </w:r>
-      <w:r>
-        <w:t xml:space="preserve">interpretation.</w:t>
-      </w:r>
-      <w:r>
-        <w:t xml:space="preserve"> </w:t>
-      </w:r>
-      <w:r>
-        <w:t xml:space="preserve">These</w:t>
-      </w:r>
-      <w:r>
-        <w:t xml:space="preserve"> </w:t>
-      </w:r>
-      <w:r>
-        <w:t xml:space="preserve">tools</w:t>
-      </w:r>
-      <w:r>
-        <w:t xml:space="preserve"> </w:t>
-      </w:r>
-      <w:r>
-        <w:t xml:space="preserve">can</w:t>
-      </w:r>
-      <w:r>
-        <w:t xml:space="preserve"> </w:t>
-      </w:r>
-      <w:r>
-        <w:t xml:space="preserve">be</w:t>
-      </w:r>
-      <w:r>
-        <w:t xml:space="preserve"> </w:t>
-      </w:r>
-      <w:r>
-        <w:t xml:space="preserve">a</w:t>
-      </w:r>
-      <w:r>
-        <w:t xml:space="preserve"> </w:t>
-      </w:r>
-      <w:r>
-        <w:t xml:space="preserve">spur</w:t>
-      </w:r>
-      <w:r>
-        <w:t xml:space="preserve"> </w:t>
-      </w:r>
-      <w:r>
-        <w:t xml:space="preserve">to</w:t>
-      </w:r>
-      <w:r>
-        <w:t xml:space="preserve"> </w:t>
-      </w:r>
-      <w:r>
-        <w:t xml:space="preserve">theory</w:t>
-      </w:r>
-      <w:r>
-        <w:t xml:space="preserve"> </w:t>
-      </w:r>
-      <w:r>
-        <w:t xml:space="preserve">building,</w:t>
-      </w:r>
-      <w:r>
-        <w:t xml:space="preserve"> </w:t>
-      </w:r>
-      <w:r>
-        <w:t xml:space="preserve">allowing</w:t>
-      </w:r>
-      <w:r>
-        <w:t xml:space="preserve"> </w:t>
-      </w:r>
-      <w:r>
-        <w:t xml:space="preserve">researchers</w:t>
-      </w:r>
-      <w:r>
-        <w:t xml:space="preserve"> </w:t>
-      </w:r>
-      <w:r>
-        <w:t xml:space="preserve">to</w:t>
-      </w:r>
-      <w:r>
-        <w:t xml:space="preserve"> </w:t>
-      </w:r>
-      <w:r>
-        <w:t xml:space="preserve">widen</w:t>
-      </w:r>
-      <w:r>
-        <w:t xml:space="preserve"> </w:t>
-      </w:r>
-      <w:r>
-        <w:t xml:space="preserve">their</w:t>
-      </w:r>
-      <w:r>
-        <w:t xml:space="preserve"> </w:t>
-      </w:r>
-      <w:r>
-        <w:t xml:space="preserve">focus</w:t>
-      </w:r>
-      <w:r>
-        <w:t xml:space="preserve"> </w:t>
-      </w:r>
-      <w:r>
-        <w:t xml:space="preserve">from</w:t>
-      </w:r>
-      <w:r>
-        <w:t xml:space="preserve"> </w:t>
-      </w:r>
-      <w:r>
-        <w:t xml:space="preserve">population</w:t>
-      </w:r>
-      <w:r>
-        <w:t xml:space="preserve"> </w:t>
-      </w:r>
-      <w:r>
-        <w:t xml:space="preserve">averages</w:t>
-      </w:r>
-      <w:r>
-        <w:t xml:space="preserve"> </w:t>
-      </w:r>
-      <w:r>
-        <w:t xml:space="preserve">to</w:t>
-      </w:r>
-      <w:r>
-        <w:t xml:space="preserve"> </w:t>
-      </w:r>
-      <w:r>
-        <w:t xml:space="preserve">population</w:t>
-      </w:r>
-      <w:r>
-        <w:t xml:space="preserve"> </w:t>
-      </w:r>
-      <w:r>
-        <w:t xml:space="preserve">heterogeneity</w:t>
-      </w:r>
-      <w:r>
-        <w:t xml:space="preserve"> </w:t>
-      </w:r>
-      <w:r>
-        <w:t xml:space="preserve">in</w:t>
-      </w:r>
-      <w:r>
-        <w:t xml:space="preserve"> </w:t>
-      </w:r>
-      <w:r>
-        <w:t xml:space="preserve">psychological</w:t>
-      </w:r>
-      <w:r>
-        <w:t xml:space="preserve"> </w:t>
-      </w:r>
-      <w:r>
-        <w:t xml:space="preserve">phenomena.</w:t>
+        <w:t xml:space="preserve">Advances in experimental, data collection, and analysis methods have brought population variability in psychological phenomena to the fore. Yet, current practices for interpreting such heterogeneity do not appropriately treat the uncertainty inevitable in any statistical summary. Heterogeneity is best thought of as a distribution of features with a mean (average person’s effect) and variance (between-person differences). This expected heterogeneity distribution can be further summarized e.g. as a heterogeneity interval</w:t>
+      </w:r>
+      <w:r>
+        <w:t xml:space="preserve"> </w:t>
+      </w:r>
+      <w:r>
+        <w:t xml:space="preserve">(Bolger et al., 2019)</w:t>
+      </w:r>
+      <w:r>
+        <w:t xml:space="preserve">. However, because empirical studies estimate the underlying mean and variance parameters with uncertainty, the expected distribution and interval will underestimate the actual range of plausible effects in the population. Using Bayesian hierarchical models, and with the aid of empirical datasets from social and cognitive psychology, we provide a walk-through of effective heterogeneity reporting and display tools that appropriately convey measures of uncertainty. We cover interval, proportion, and ratio measures of heterogeneity and their estimation and interpretation. These tools can be a spur to theory building, allowing researchers to widen their focus from population averages to population heterogeneity in psychological phenomena.</w:t>
       </w:r>
     </w:p>
     <w:p>
@@ -1467,7 +411,169 @@
                     <w:jc w:val="center"/>
                   </w:pPr>
                   <w:r>
-                    <w:t xml:space="preserve">6</w:t>
+                    <w:t xml:space="preserve">1</w:t>
+                  </w:r>
+                </w:p>
+              </w:tc>
+              <w:tc>
+                <w:tcPr/>
+                <w:p>
+                  <w:pPr>
+                    <w:pStyle w:val="Compact"/>
+                    <w:jc w:val="left"/>
+                    <w:jc w:val="center"/>
+                  </w:pPr>
+                  <w:r>
+                    <w:t xml:space="preserve">Negative</w:t>
+                  </w:r>
+                </w:p>
+              </w:tc>
+              <w:tc>
+                <w:tcPr/>
+                <w:p>
+                  <w:pPr>
+                    <w:pStyle w:val="Compact"/>
+                    <w:jc w:val="right"/>
+                    <w:jc w:val="center"/>
+                  </w:pPr>
+                  <w:r>
+                    <w:t xml:space="preserve">7.2</w:t>
+                  </w:r>
+                </w:p>
+              </w:tc>
+            </w:tr>
+            <w:tr>
+              <w:tc>
+                <w:tcPr/>
+                <w:p>
+                  <w:pPr>
+                    <w:pStyle w:val="Compact"/>
+                    <w:jc w:val="left"/>
+                    <w:jc w:val="center"/>
+                  </w:pPr>
+                  <w:r>
+                    <w:t xml:space="preserve">01</w:t>
+                  </w:r>
+                </w:p>
+              </w:tc>
+              <w:tc>
+                <w:tcPr/>
+                <w:p>
+                  <w:pPr>
+                    <w:pStyle w:val="Compact"/>
+                    <w:jc w:val="right"/>
+                    <w:jc w:val="center"/>
+                  </w:pPr>
+                  <w:r>
+                    <w:t xml:space="preserve">3</w:t>
+                  </w:r>
+                </w:p>
+              </w:tc>
+              <w:tc>
+                <w:tcPr/>
+                <w:p>
+                  <w:pPr>
+                    <w:pStyle w:val="Compact"/>
+                    <w:jc w:val="left"/>
+                    <w:jc w:val="center"/>
+                  </w:pPr>
+                  <w:r>
+                    <w:t xml:space="preserve">Negative</w:t>
+                  </w:r>
+                </w:p>
+              </w:tc>
+              <w:tc>
+                <w:tcPr/>
+                <w:p>
+                  <w:pPr>
+                    <w:pStyle w:val="Compact"/>
+                    <w:jc w:val="right"/>
+                    <w:jc w:val="center"/>
+                  </w:pPr>
+                  <w:r>
+                    <w:t xml:space="preserve">7.1</w:t>
+                  </w:r>
+                </w:p>
+              </w:tc>
+            </w:tr>
+            <w:tr>
+              <w:tc>
+                <w:tcPr/>
+                <w:p>
+                  <w:pPr>
+                    <w:pStyle w:val="Compact"/>
+                    <w:jc w:val="left"/>
+                    <w:jc w:val="center"/>
+                  </w:pPr>
+                  <w:r>
+                    <w:t xml:space="preserve">01</w:t>
+                  </w:r>
+                </w:p>
+              </w:tc>
+              <w:tc>
+                <w:tcPr/>
+                <w:p>
+                  <w:pPr>
+                    <w:pStyle w:val="Compact"/>
+                    <w:jc w:val="right"/>
+                    <w:jc w:val="center"/>
+                  </w:pPr>
+                  <w:r>
+                    <w:t xml:space="preserve">4</w:t>
+                  </w:r>
+                </w:p>
+              </w:tc>
+              <w:tc>
+                <w:tcPr/>
+                <w:p>
+                  <w:pPr>
+                    <w:pStyle w:val="Compact"/>
+                    <w:jc w:val="left"/>
+                    <w:jc w:val="center"/>
+                  </w:pPr>
+                  <w:r>
+                    <w:t xml:space="preserve">Negative</w:t>
+                  </w:r>
+                </w:p>
+              </w:tc>
+              <w:tc>
+                <w:tcPr/>
+                <w:p>
+                  <w:pPr>
+                    <w:pStyle w:val="Compact"/>
+                    <w:jc w:val="right"/>
+                    <w:jc w:val="center"/>
+                  </w:pPr>
+                  <w:r>
+                    <w:t xml:space="preserve">7.0</w:t>
+                  </w:r>
+                </w:p>
+              </w:tc>
+            </w:tr>
+            <w:tr>
+              <w:tc>
+                <w:tcPr/>
+                <w:p>
+                  <w:pPr>
+                    <w:pStyle w:val="Compact"/>
+                    <w:jc w:val="left"/>
+                    <w:jc w:val="center"/>
+                  </w:pPr>
+                  <w:r>
+                    <w:t xml:space="preserve">01</w:t>
+                  </w:r>
+                </w:p>
+              </w:tc>
+              <w:tc>
+                <w:tcPr/>
+                <w:p>
+                  <w:pPr>
+                    <w:pStyle w:val="Compact"/>
+                    <w:jc w:val="right"/>
+                    <w:jc w:val="center"/>
+                  </w:pPr>
+                  <w:r>
+                    <w:t xml:space="preserve">5</w:t>
                   </w:r>
                 </w:p>
               </w:tc>
@@ -1493,7 +599,7 @@
                     <w:jc w:val="center"/>
                   </w:pPr>
                   <w:r>
-                    <w:t xml:space="preserve">6.8</w:t>
+                    <w:t xml:space="preserve">6.6</w:t>
                   </w:r>
                 </w:p>
               </w:tc>
@@ -1521,7 +627,61 @@
                     <w:jc w:val="center"/>
                   </w:pPr>
                   <w:r>
-                    <w:t xml:space="preserve">9</w:t>
+                    <w:t xml:space="preserve">6</w:t>
+                  </w:r>
+                </w:p>
+              </w:tc>
+              <w:tc>
+                <w:tcPr/>
+                <w:p>
+                  <w:pPr>
+                    <w:pStyle w:val="Compact"/>
+                    <w:jc w:val="left"/>
+                    <w:jc w:val="center"/>
+                  </w:pPr>
+                  <w:r>
+                    <w:t xml:space="preserve">Negative</w:t>
+                  </w:r>
+                </w:p>
+              </w:tc>
+              <w:tc>
+                <w:tcPr/>
+                <w:p>
+                  <w:pPr>
+                    <w:pStyle w:val="Compact"/>
+                    <w:jc w:val="right"/>
+                    <w:jc w:val="center"/>
+                  </w:pPr>
+                  <w:r>
+                    <w:t xml:space="preserve">6.7</w:t>
+                  </w:r>
+                </w:p>
+              </w:tc>
+            </w:tr>
+            <w:tr>
+              <w:tc>
+                <w:tcPr/>
+                <w:p>
+                  <w:pPr>
+                    <w:pStyle w:val="Compact"/>
+                    <w:jc w:val="left"/>
+                    <w:jc w:val="center"/>
+                  </w:pPr>
+                  <w:r>
+                    <w:t xml:space="preserve">01</w:t>
+                  </w:r>
+                </w:p>
+              </w:tc>
+              <w:tc>
+                <w:tcPr/>
+                <w:p>
+                  <w:pPr>
+                    <w:pStyle w:val="Compact"/>
+                    <w:jc w:val="right"/>
+                    <w:jc w:val="center"/>
+                  </w:pPr>
+                  <w:r>
+                    <w:t xml:space="preserve">7</w:t>
                   </w:r>
                 </w:p>
               </w:tc>
@@ -1548,222 +708,6 @@
                   </w:pPr>
                   <w:r>
                     <w:t xml:space="preserve">6.6</w:t>
-                  </w:r>
-                </w:p>
-              </w:tc>
-            </w:tr>
-            <w:tr>
-              <w:tc>
-                <w:tcPr/>
-                <w:p>
-                  <w:pPr>
-                    <w:pStyle w:val="Compact"/>
-                    <w:jc w:val="left"/>
-                    <w:jc w:val="center"/>
-                  </w:pPr>
-                  <w:r>
-                    <w:t xml:space="preserve">01</w:t>
-                  </w:r>
-                </w:p>
-              </w:tc>
-              <w:tc>
-                <w:tcPr/>
-                <w:p>
-                  <w:pPr>
-                    <w:pStyle w:val="Compact"/>
-                    <w:jc w:val="right"/>
-                    <w:jc w:val="center"/>
-                  </w:pPr>
-                  <w:r>
-                    <w:t xml:space="preserve">10</w:t>
-                  </w:r>
-                </w:p>
-              </w:tc>
-              <w:tc>
-                <w:tcPr/>
-                <w:p>
-                  <w:pPr>
-                    <w:pStyle w:val="Compact"/>
-                    <w:jc w:val="left"/>
-                    <w:jc w:val="center"/>
-                  </w:pPr>
-                  <w:r>
-                    <w:t xml:space="preserve">Positive</w:t>
-                  </w:r>
-                </w:p>
-              </w:tc>
-              <w:tc>
-                <w:tcPr/>
-                <w:p>
-                  <w:pPr>
-                    <w:pStyle w:val="Compact"/>
-                    <w:jc w:val="right"/>
-                    <w:jc w:val="center"/>
-                  </w:pPr>
-                  <w:r>
-                    <w:t xml:space="preserve">6.7</w:t>
-                  </w:r>
-                </w:p>
-              </w:tc>
-            </w:tr>
-            <w:tr>
-              <w:tc>
-                <w:tcPr/>
-                <w:p>
-                  <w:pPr>
-                    <w:pStyle w:val="Compact"/>
-                    <w:jc w:val="left"/>
-                    <w:jc w:val="center"/>
-                  </w:pPr>
-                  <w:r>
-                    <w:t xml:space="preserve">01</w:t>
-                  </w:r>
-                </w:p>
-              </w:tc>
-              <w:tc>
-                <w:tcPr/>
-                <w:p>
-                  <w:pPr>
-                    <w:pStyle w:val="Compact"/>
-                    <w:jc w:val="right"/>
-                    <w:jc w:val="center"/>
-                  </w:pPr>
-                  <w:r>
-                    <w:t xml:space="preserve">12</w:t>
-                  </w:r>
-                </w:p>
-              </w:tc>
-              <w:tc>
-                <w:tcPr/>
-                <w:p>
-                  <w:pPr>
-                    <w:pStyle w:val="Compact"/>
-                    <w:jc w:val="left"/>
-                    <w:jc w:val="center"/>
-                  </w:pPr>
-                  <w:r>
-                    <w:t xml:space="preserve">Positive</w:t>
-                  </w:r>
-                </w:p>
-              </w:tc>
-              <w:tc>
-                <w:tcPr/>
-                <w:p>
-                  <w:pPr>
-                    <w:pStyle w:val="Compact"/>
-                    <w:jc w:val="right"/>
-                    <w:jc w:val="center"/>
-                  </w:pPr>
-                  <w:r>
-                    <w:t xml:space="preserve">6.7</w:t>
-                  </w:r>
-                </w:p>
-              </w:tc>
-            </w:tr>
-            <w:tr>
-              <w:tc>
-                <w:tcPr/>
-                <w:p>
-                  <w:pPr>
-                    <w:pStyle w:val="Compact"/>
-                    <w:jc w:val="left"/>
-                    <w:jc w:val="center"/>
-                  </w:pPr>
-                  <w:r>
-                    <w:t xml:space="preserve">01</w:t>
-                  </w:r>
-                </w:p>
-              </w:tc>
-              <w:tc>
-                <w:tcPr/>
-                <w:p>
-                  <w:pPr>
-                    <w:pStyle w:val="Compact"/>
-                    <w:jc w:val="right"/>
-                    <w:jc w:val="center"/>
-                  </w:pPr>
-                  <w:r>
-                    <w:t xml:space="preserve">13</w:t>
-                  </w:r>
-                </w:p>
-              </w:tc>
-              <w:tc>
-                <w:tcPr/>
-                <w:p>
-                  <w:pPr>
-                    <w:pStyle w:val="Compact"/>
-                    <w:jc w:val="left"/>
-                    <w:jc w:val="center"/>
-                  </w:pPr>
-                  <w:r>
-                    <w:t xml:space="preserve">Positive</w:t>
-                  </w:r>
-                </w:p>
-              </w:tc>
-              <w:tc>
-                <w:tcPr/>
-                <w:p>
-                  <w:pPr>
-                    <w:pStyle w:val="Compact"/>
-                    <w:jc w:val="right"/>
-                    <w:jc w:val="center"/>
-                  </w:pPr>
-                  <w:r>
-                    <w:t xml:space="preserve">6.4</w:t>
-                  </w:r>
-                </w:p>
-              </w:tc>
-            </w:tr>
-            <w:tr>
-              <w:tc>
-                <w:tcPr/>
-                <w:p>
-                  <w:pPr>
-                    <w:pStyle w:val="Compact"/>
-                    <w:jc w:val="left"/>
-                    <w:jc w:val="center"/>
-                  </w:pPr>
-                  <w:r>
-                    <w:t xml:space="preserve">01</w:t>
-                  </w:r>
-                </w:p>
-              </w:tc>
-              <w:tc>
-                <w:tcPr/>
-                <w:p>
-                  <w:pPr>
-                    <w:pStyle w:val="Compact"/>
-                    <w:jc w:val="right"/>
-                    <w:jc w:val="center"/>
-                  </w:pPr>
-                  <w:r>
-                    <w:t xml:space="preserve">16</w:t>
-                  </w:r>
-                </w:p>
-              </w:tc>
-              <w:tc>
-                <w:tcPr/>
-                <w:p>
-                  <w:pPr>
-                    <w:pStyle w:val="Compact"/>
-                    <w:jc w:val="left"/>
-                    <w:jc w:val="center"/>
-                  </w:pPr>
-                  <w:r>
-                    <w:t xml:space="preserve">Positive</w:t>
-                  </w:r>
-                </w:p>
-              </w:tc>
-              <w:tc>
-                <w:tcPr/>
-                <w:p>
-                  <w:pPr>
-                    <w:pStyle w:val="Compact"/>
-                    <w:jc w:val="right"/>
-                    <w:jc w:val="center"/>
-                  </w:pPr>
-                  <w:r>
-                    <w:t xml:space="preserve">6.5</w:t>
                   </w:r>
                 </w:p>
               </w:tc>
@@ -2271,13 +1215,7 @@
         <w:t xml:space="preserve"> </w:t>
       </w:r>
       <w:r>
-        <w:t xml:space="preserve">“</w:t>
-      </w:r>
-      <w:r>
-        <w:t xml:space="preserve">fixed</w:t>
-      </w:r>
-      <w:r>
-        <w:t xml:space="preserve">”</w:t>
+        <w:t xml:space="preserve">“fixed”</w:t>
       </w:r>
       <w:r>
         <w:t xml:space="preserve"> </w:t>
@@ -2432,13 +1370,7 @@
         <w:t xml:space="preserve"> </w:t>
       </w:r>
       <w:r>
-        <w:t xml:space="preserve">“</w:t>
-      </w:r>
-      <w:r>
-        <w:t xml:space="preserve">random</w:t>
-      </w:r>
-      <w:r>
-        <w:t xml:space="preserve">”</w:t>
+        <w:t xml:space="preserve">“random”</w:t>
       </w:r>
       <w:r>
         <w:t xml:space="preserve"> </w:t>
@@ -4579,13 +3511,7 @@
         <w:t xml:space="preserve"> </w:t>
       </w:r>
       <w:r>
-        <w:t xml:space="preserve">“</w:t>
-      </w:r>
-      <w:r>
-        <w:t xml:space="preserve">What proportion of individuals in the population endorse faster to positively valenced words?</w:t>
-      </w:r>
-      <w:r>
-        <w:t xml:space="preserve">”</w:t>
+        <w:t xml:space="preserve">“What proportion of individuals in the population endorse faster to positively valenced words?”</w:t>
       </w:r>
       <w:r>
         <w:t xml:space="preserve"> </w:t>
@@ -6493,13 +5419,7 @@
         <w:t xml:space="preserve">shows summaries of Model 1’s population-level parameters’ (</w:t>
       </w:r>
       <w:r>
-        <w:t xml:space="preserve">“</w:t>
-      </w:r>
-      <w:r>
-        <w:t xml:space="preserve">fixed</w:t>
-      </w:r>
-      <w:r>
-        <w:t xml:space="preserve">”</w:t>
+        <w:t xml:space="preserve">“fixed”</w:t>
       </w:r>
       <w:r>
         <w:t xml:space="preserve"> </w:t>
@@ -8168,13 +7088,7 @@
         <w:t xml:space="preserve"> </w:t>
       </w:r>
       <w:r>
-        <w:t xml:space="preserve">“</w:t>
-      </w:r>
-      <w:r>
-        <w:t xml:space="preserve">What proportion of individuals in the population endorse positive words faster than negative words?</w:t>
-      </w:r>
-      <w:r>
-        <w:t xml:space="preserve">”</w:t>
+        <w:t xml:space="preserve">“What proportion of individuals in the population endorse positive words faster than negative words?”</w:t>
       </w:r>
     </w:p>
     <w:tbl>
@@ -10130,13 +9044,7 @@
         <w:t xml:space="preserve"> </w:t>
       </w:r>
       <w:r>
-        <w:t xml:space="preserve">“</w:t>
-      </w:r>
-      <w:r>
-        <w:t xml:space="preserve">linear predictor</w:t>
-      </w:r>
-      <w:r>
-        <w:t xml:space="preserve">”</w:t>
+        <w:t xml:space="preserve">“linear predictor”</w:t>
       </w:r>
       <w:r>
         <w:t xml:space="preserve"> </w:t>
@@ -11791,13 +10699,7 @@
         <w:t xml:space="preserve">Mah &amp; Lindsay (2024)</w:t>
       </w:r>
       <w:r>
-        <w:t xml:space="preserve">‘</w:t>
-      </w:r>
-      <w:r>
-        <w:t xml:space="preserve">s finding that participants</w:t>
-      </w:r>
-      <w:r>
-        <w:t xml:space="preserve">’</w:t>
+        <w:t xml:space="preserve">‘s finding that participants’</w:t>
       </w:r>
       <w:r>
         <w:t xml:space="preserve"> </w:t>
@@ -11862,13 +10764,7 @@
         <w:t xml:space="preserve"> </w:t>
       </w:r>
       <w:r>
-        <w:t xml:space="preserve">“</w:t>
-      </w:r>
-      <w:r>
-        <w:t xml:space="preserve">z-scores</w:t>
-      </w:r>
-      <w:r>
-        <w:t xml:space="preserve">”</w:t>
+        <w:t xml:space="preserve">“z-scores”</w:t>
       </w:r>
       <w:r>
         <w:t xml:space="preserve">) because of the link function we used. Therefore, for example zero translates to 50% accuracy.</w:t>
@@ -12517,13 +11413,7 @@
         <w:t xml:space="preserve">Mah &amp; Lindsay (2024)</w:t>
       </w:r>
       <w:r>
-        <w:t xml:space="preserve">‘</w:t>
-      </w:r>
-      <w:r>
-        <w:t xml:space="preserve">s study and our analysis of the dataset afforded an additional piece of information: Because the same target words were used across the two tasks, we could examine the consistency of target words</w:t>
-      </w:r>
-      <w:r>
-        <w:t xml:space="preserve">’</w:t>
+        <w:t xml:space="preserve">‘s study and our analysis of the dataset afforded an additional piece of information: Because the same target words were used across the two tasks, we could examine the consistency of target words’</w:t>
       </w:r>
       <w:r>
         <w:t xml:space="preserve"> </w:t>
@@ -12671,13 +11561,7 @@
         <w:t xml:space="preserve"> </w:t>
       </w:r>
       <w:r>
-        <w:t xml:space="preserve">“</w:t>
-      </w:r>
-      <w:r>
-        <w:t xml:space="preserve">past efforts to identify heterogeneous effects have yielded a disproportionate number of disappointing, uninterpretable, and non-replicable findings</w:t>
-      </w:r>
-      <w:r>
-        <w:t xml:space="preserve">”</w:t>
+        <w:t xml:space="preserve">“past efforts to identify heterogeneous effects have yielded a disproportionate number of disappointing, uninterpretable, and non-replicable findings”</w:t>
       </w:r>
       <w:r>
         <w:t xml:space="preserve">, and suggest low power as one potential antecedent. While perhaps an overstatement, one reason for why previous investigations of heterogeneity may have been suboptimal indeed relates to statistical power: By not duly incorporating and reporting on the uncertainty with which heterogeneity is estimated, investigations are more suspect for reporting substantial heterogeneity where it may not truly exist.</w:t>
@@ -12782,7 +11666,7 @@
     </w:p>
     <w:bookmarkEnd w:id="96"/>
     <w:bookmarkEnd w:id="97"/>
-    <w:bookmarkStart w:id="101" w:name="disclosures"/>
+    <w:bookmarkStart w:id="160" w:name="disclosures"/>
     <w:p>
       <w:pPr>
         <w:pStyle w:val="Heading1"/>
@@ -12890,7 +11774,7 @@
       </w:r>
     </w:p>
     <w:bookmarkEnd w:id="99"/>
-    <w:bookmarkStart w:id="100" w:name="competing-interests"/>
+    <w:bookmarkStart w:id="159" w:name="competing-interests"/>
     <w:p>
       <w:pPr>
         <w:pStyle w:val="Heading2"/>
@@ -12907,19 +11791,8 @@
         <w:t xml:space="preserve">The author(s) declare no competing interests.</w:t>
       </w:r>
     </w:p>
-    <w:bookmarkEnd w:id="100"/>
-    <w:bookmarkEnd w:id="101"/>
-    <w:bookmarkStart w:id="161" w:name="references"/>
-    <w:p>
-      <w:pPr>
-        <w:pStyle w:val="Heading1"/>
-      </w:pPr>
-      <w:r>
-        <w:t xml:space="preserve">References</w:t>
-      </w:r>
-    </w:p>
-    <w:bookmarkStart w:id="160" w:name="refs"/>
-    <w:bookmarkStart w:id="103" w:name="ref-anvariUsingAnchorbasedMethods2021"/>
+    <w:bookmarkStart w:id="158" w:name="refs"/>
+    <w:bookmarkStart w:id="101" w:name="ref-anvariUsingAnchorbasedMethods2021"/>
     <w:p>
       <w:pPr>
         <w:pStyle w:val="Bibliography"/>
@@ -12956,7 +11829,7 @@
       <w:r>
         <w:t xml:space="preserve"> </w:t>
       </w:r>
-      <w:hyperlink r:id="rId102">
+      <w:hyperlink r:id="rId100">
         <w:r>
           <w:rPr>
             <w:rStyle w:val="Hyperlink"/>
@@ -12965,8 +11838,8 @@
         </w:r>
       </w:hyperlink>
     </w:p>
-    <w:bookmarkEnd w:id="103"/>
-    <w:bookmarkStart w:id="105" w:name="ref-bartosFairCoinsTend2023"/>
+    <w:bookmarkEnd w:id="101"/>
+    <w:bookmarkStart w:id="103" w:name="ref-bartosFairCoinsTend2023"/>
     <w:p>
       <w:pPr>
         <w:pStyle w:val="Bibliography"/>
@@ -13032,7 +11905,7 @@
       <w:r>
         <w:t xml:space="preserve"> </w:t>
       </w:r>
-      <w:hyperlink r:id="rId104">
+      <w:hyperlink r:id="rId102">
         <w:r>
           <w:rPr>
             <w:rStyle w:val="Hyperlink"/>
@@ -13041,8 +11914,8 @@
         </w:r>
       </w:hyperlink>
     </w:p>
-    <w:bookmarkEnd w:id="105"/>
-    <w:bookmarkStart w:id="107" w:name="ref-batesFittingLinearMixedEffects2015"/>
+    <w:bookmarkEnd w:id="103"/>
+    <w:bookmarkStart w:id="105" w:name="ref-batesFittingLinearMixedEffects2015"/>
     <w:p>
       <w:pPr>
         <w:pStyle w:val="Bibliography"/>
@@ -13091,7 +11964,7 @@
       <w:r>
         <w:t xml:space="preserve"> </w:t>
       </w:r>
-      <w:hyperlink r:id="rId106">
+      <w:hyperlink r:id="rId104">
         <w:r>
           <w:rPr>
             <w:rStyle w:val="Hyperlink"/>
@@ -13100,8 +11973,8 @@
         </w:r>
       </w:hyperlink>
     </w:p>
-    <w:bookmarkEnd w:id="107"/>
-    <w:bookmarkStart w:id="109" w:name="ref-beck2022"/>
+    <w:bookmarkEnd w:id="105"/>
+    <w:bookmarkStart w:id="107" w:name="ref-beck2022"/>
     <w:p>
       <w:pPr>
         <w:pStyle w:val="Bibliography"/>
@@ -13128,7 +12001,7 @@
       <w:r>
         <w:t xml:space="preserve"> </w:t>
       </w:r>
-      <w:hyperlink r:id="rId108">
+      <w:hyperlink r:id="rId106">
         <w:r>
           <w:rPr>
             <w:rStyle w:val="Hyperlink"/>
@@ -13137,8 +12010,8 @@
         </w:r>
       </w:hyperlink>
     </w:p>
-    <w:bookmarkEnd w:id="109"/>
-    <w:bookmarkStart w:id="111" w:name="ref-beyensEffectSocialMedia2020"/>
+    <w:bookmarkEnd w:id="107"/>
+    <w:bookmarkStart w:id="109" w:name="ref-beyensEffectSocialMedia2020"/>
     <w:p>
       <w:pPr>
         <w:pStyle w:val="Bibliography"/>
@@ -13175,7 +12048,7 @@
       <w:r>
         <w:t xml:space="preserve"> </w:t>
       </w:r>
-      <w:hyperlink r:id="rId110">
+      <w:hyperlink r:id="rId108">
         <w:r>
           <w:rPr>
             <w:rStyle w:val="Hyperlink"/>
@@ -13184,8 +12057,8 @@
         </w:r>
       </w:hyperlink>
     </w:p>
-    <w:bookmarkEnd w:id="111"/>
-    <w:bookmarkStart w:id="113" w:name="ref-bolgerCausalProcessesPsychology2019"/>
+    <w:bookmarkEnd w:id="109"/>
+    <w:bookmarkStart w:id="111" w:name="ref-bolgerCausalProcessesPsychology2019"/>
     <w:p>
       <w:pPr>
         <w:pStyle w:val="Bibliography"/>
@@ -13222,7 +12095,7 @@
       <w:r>
         <w:t xml:space="preserve"> </w:t>
       </w:r>
-      <w:hyperlink r:id="rId112">
+      <w:hyperlink r:id="rId110">
         <w:r>
           <w:rPr>
             <w:rStyle w:val="Hyperlink"/>
@@ -13231,8 +12104,8 @@
         </w:r>
       </w:hyperlink>
     </w:p>
-    <w:bookmarkEnd w:id="113"/>
-    <w:bookmarkStart w:id="115" w:name="ref-brandCausalEffectHeterogeneity2013"/>
+    <w:bookmarkEnd w:id="111"/>
+    <w:bookmarkStart w:id="113" w:name="ref-brandCausalEffectHeterogeneity2013"/>
     <w:p>
       <w:pPr>
         <w:pStyle w:val="Bibliography"/>
@@ -13319,7 +12192,7 @@
       <w:r>
         <w:t xml:space="preserve"> </w:t>
       </w:r>
-      <w:hyperlink r:id="rId114">
+      <w:hyperlink r:id="rId112">
         <w:r>
           <w:rPr>
             <w:rStyle w:val="Hyperlink"/>
@@ -13328,8 +12201,8 @@
         </w:r>
       </w:hyperlink>
     </w:p>
-    <w:bookmarkEnd w:id="115"/>
-    <w:bookmarkStart w:id="117" w:name="ref-burknerBrmsPackageBayesian2017"/>
+    <w:bookmarkEnd w:id="113"/>
+    <w:bookmarkStart w:id="115" w:name="ref-burknerBrmsPackageBayesian2017"/>
     <w:p>
       <w:pPr>
         <w:pStyle w:val="Bibliography"/>
@@ -13387,7 +12260,7 @@
       <w:r>
         <w:t xml:space="preserve"> </w:t>
       </w:r>
-      <w:hyperlink r:id="rId116">
+      <w:hyperlink r:id="rId114">
         <w:r>
           <w:rPr>
             <w:rStyle w:val="Hyperlink"/>
@@ -13396,8 +12269,8 @@
         </w:r>
       </w:hyperlink>
     </w:p>
-    <w:bookmarkEnd w:id="117"/>
-    <w:bookmarkStart w:id="119" w:name="Xb1b727604402d24aa6cf353a8afd8d5ce54fc16"/>
+    <w:bookmarkEnd w:id="115"/>
+    <w:bookmarkStart w:id="117" w:name="Xb1b727604402d24aa6cf353a8afd8d5ce54fc16"/>
     <w:p>
       <w:pPr>
         <w:pStyle w:val="Bibliography"/>
@@ -13458,7 +12331,7 @@
       <w:r>
         <w:t xml:space="preserve"> </w:t>
       </w:r>
-      <w:hyperlink r:id="rId118">
+      <w:hyperlink r:id="rId116">
         <w:r>
           <w:rPr>
             <w:rStyle w:val="Hyperlink"/>
@@ -13467,8 +12340,8 @@
         </w:r>
       </w:hyperlink>
     </w:p>
-    <w:bookmarkEnd w:id="119"/>
-    <w:bookmarkStart w:id="120" w:name="ref-gelmanBayesianDataAnalysis2013"/>
+    <w:bookmarkEnd w:id="117"/>
+    <w:bookmarkStart w:id="118" w:name="ref-gelmanBayesianDataAnalysis2013"/>
     <w:p>
       <w:pPr>
         <w:pStyle w:val="Bibliography"/>
@@ -13534,8 +12407,8 @@
         <w:t xml:space="preserve">.</w:t>
       </w:r>
     </w:p>
-    <w:bookmarkEnd w:id="120"/>
-    <w:bookmarkStart w:id="121" w:name="ref-gelmanDataAnalysisUsing2007"/>
+    <w:bookmarkEnd w:id="118"/>
+    <w:bookmarkStart w:id="119" w:name="ref-gelmanDataAnalysisUsing2007"/>
     <w:p>
       <w:pPr>
         <w:pStyle w:val="Bibliography"/>
@@ -13622,8 +12495,8 @@
         <w:t xml:space="preserve">.</w:t>
       </w:r>
     </w:p>
-    <w:bookmarkEnd w:id="121"/>
-    <w:bookmarkStart w:id="123" w:name="ref-gricePersonsEffectSizes2020"/>
+    <w:bookmarkEnd w:id="119"/>
+    <w:bookmarkStart w:id="121" w:name="ref-gricePersonsEffectSizes2020"/>
     <w:p>
       <w:pPr>
         <w:pStyle w:val="Bibliography"/>
@@ -13669,7 +12542,7 @@
       <w:r>
         <w:t xml:space="preserve"> </w:t>
       </w:r>
-      <w:hyperlink r:id="rId122">
+      <w:hyperlink r:id="rId120">
         <w:r>
           <w:rPr>
             <w:rStyle w:val="Hyperlink"/>
@@ -13678,8 +12551,8 @@
         </w:r>
       </w:hyperlink>
     </w:p>
-    <w:bookmarkEnd w:id="123"/>
-    <w:bookmarkStart w:id="125" w:name="ref-haafDevelopingConstraintBayesian2017"/>
+    <w:bookmarkEnd w:id="121"/>
+    <w:bookmarkStart w:id="123" w:name="ref-haafDevelopingConstraintBayesian2017"/>
     <w:p>
       <w:pPr>
         <w:pStyle w:val="Bibliography"/>
@@ -13716,7 +12589,7 @@
       <w:r>
         <w:t xml:space="preserve"> </w:t>
       </w:r>
-      <w:hyperlink r:id="rId124">
+      <w:hyperlink r:id="rId122">
         <w:r>
           <w:rPr>
             <w:rStyle w:val="Hyperlink"/>
@@ -13725,8 +12598,8 @@
         </w:r>
       </w:hyperlink>
     </w:p>
-    <w:bookmarkEnd w:id="125"/>
-    <w:bookmarkStart w:id="127" w:name="ref-haafDonAccountingVariability2019"/>
+    <w:bookmarkEnd w:id="123"/>
+    <w:bookmarkStart w:id="125" w:name="ref-haafDonAccountingVariability2019"/>
     <w:p>
       <w:pPr>
         <w:pStyle w:val="Bibliography"/>
@@ -13775,7 +12648,7 @@
       <w:r>
         <w:t xml:space="preserve"> </w:t>
       </w:r>
-      <w:hyperlink r:id="rId126">
+      <w:hyperlink r:id="rId124">
         <w:r>
           <w:rPr>
             <w:rStyle w:val="Hyperlink"/>
@@ -13784,8 +12657,8 @@
         </w:r>
       </w:hyperlink>
     </w:p>
-    <w:bookmarkEnd w:id="127"/>
-    <w:bookmarkStart w:id="129" w:name="ref-juddTreatingStimuliRandom2012"/>
+    <w:bookmarkEnd w:id="125"/>
+    <w:bookmarkStart w:id="127" w:name="ref-juddTreatingStimuliRandom2012"/>
     <w:p>
       <w:pPr>
         <w:pStyle w:val="Bibliography"/>
@@ -13834,7 +12707,7 @@
       <w:r>
         <w:t xml:space="preserve"> </w:t>
       </w:r>
-      <w:hyperlink r:id="rId128">
+      <w:hyperlink r:id="rId126">
         <w:r>
           <w:rPr>
             <w:rStyle w:val="Hyperlink"/>
@@ -13843,8 +12716,8 @@
         </w:r>
       </w:hyperlink>
     </w:p>
-    <w:bookmarkEnd w:id="129"/>
-    <w:bookmarkStart w:id="131" w:name="ref-juddExperimentsMoreOne2017"/>
+    <w:bookmarkEnd w:id="127"/>
+    <w:bookmarkStart w:id="129" w:name="ref-juddExperimentsMoreOne2017"/>
     <w:p>
       <w:pPr>
         <w:pStyle w:val="Bibliography"/>
@@ -13917,7 +12790,7 @@
       <w:r>
         <w:t xml:space="preserve"> </w:t>
       </w:r>
-      <w:hyperlink r:id="rId130">
+      <w:hyperlink r:id="rId128">
         <w:r>
           <w:rPr>
             <w:rStyle w:val="Hyperlink"/>
@@ -13926,8 +12799,8 @@
         </w:r>
       </w:hyperlink>
     </w:p>
-    <w:bookmarkEnd w:id="131"/>
-    <w:bookmarkStart w:id="132" w:name="ref-kruschkeDoingBayesianData2014"/>
+    <w:bookmarkEnd w:id="129"/>
+    <w:bookmarkStart w:id="130" w:name="ref-kruschkeDoingBayesianData2014"/>
     <w:p>
       <w:pPr>
         <w:pStyle w:val="Bibliography"/>
@@ -14024,8 +12897,8 @@
         <w:t xml:space="preserve">.</w:t>
       </w:r>
     </w:p>
-    <w:bookmarkEnd w:id="132"/>
-    <w:bookmarkStart w:id="134" w:name="ref-kruschkeBayesianDataAnalysis2017"/>
+    <w:bookmarkEnd w:id="130"/>
+    <w:bookmarkStart w:id="132" w:name="ref-kruschkeBayesianDataAnalysis2017"/>
     <w:p>
       <w:pPr>
         <w:pStyle w:val="Bibliography"/>
@@ -14049,7 +12922,7 @@
       <w:r>
         <w:t xml:space="preserve"> </w:t>
       </w:r>
-      <w:hyperlink r:id="rId133">
+      <w:hyperlink r:id="rId131">
         <w:r>
           <w:rPr>
             <w:rStyle w:val="Hyperlink"/>
@@ -14058,8 +12931,8 @@
         </w:r>
       </w:hyperlink>
     </w:p>
-    <w:bookmarkEnd w:id="134"/>
-    <w:bookmarkStart w:id="136" w:name="X752a8fa33c06a6f776810036dea13d79570b806"/>
+    <w:bookmarkEnd w:id="132"/>
+    <w:bookmarkStart w:id="134" w:name="X752a8fa33c06a6f776810036dea13d79570b806"/>
     <w:p>
       <w:pPr>
         <w:pStyle w:val="Bibliography"/>
@@ -14126,7 +12999,7 @@
       <w:r>
         <w:t xml:space="preserve"> </w:t>
       </w:r>
-      <w:hyperlink r:id="rId135">
+      <w:hyperlink r:id="rId133">
         <w:r>
           <w:rPr>
             <w:rStyle w:val="Hyperlink"/>
@@ -14135,8 +13008,8 @@
         </w:r>
       </w:hyperlink>
     </w:p>
-    <w:bookmarkEnd w:id="136"/>
-    <w:bookmarkStart w:id="138" w:name="ref-mahVariabilitySubjectsFree2024"/>
+    <w:bookmarkEnd w:id="134"/>
+    <w:bookmarkStart w:id="136" w:name="ref-mahVariabilitySubjectsFree2024"/>
     <w:p>
       <w:pPr>
         <w:pStyle w:val="Bibliography"/>
@@ -14173,7 +13046,7 @@
       <w:r>
         <w:t xml:space="preserve"> </w:t>
       </w:r>
-      <w:hyperlink r:id="rId137">
+      <w:hyperlink r:id="rId135">
         <w:r>
           <w:rPr>
             <w:rStyle w:val="Hyperlink"/>
@@ -14182,8 +13055,8 @@
         </w:r>
       </w:hyperlink>
     </w:p>
-    <w:bookmarkEnd w:id="138"/>
-    <w:bookmarkStart w:id="139" w:name="X7e5fcb01483c46ceec3804400aa01747d15580c"/>
+    <w:bookmarkEnd w:id="136"/>
+    <w:bookmarkStart w:id="137" w:name="X7e5fcb01483c46ceec3804400aa01747d15580c"/>
     <w:p>
       <w:pPr>
         <w:pStyle w:val="Bibliography"/>
@@ -14287,8 +13160,8 @@
         <w:t xml:space="preserve">.</w:t>
       </w:r>
     </w:p>
-    <w:bookmarkEnd w:id="139"/>
-    <w:bookmarkStart w:id="141" w:name="X9908c3c11d2ce7c45992bd046a78b3587daa4e5"/>
+    <w:bookmarkEnd w:id="137"/>
+    <w:bookmarkStart w:id="139" w:name="X9908c3c11d2ce7c45992bd046a78b3587daa4e5"/>
     <w:p>
       <w:pPr>
         <w:pStyle w:val="Bibliography"/>
@@ -14429,7 +13302,7 @@
       <w:r>
         <w:t xml:space="preserve"> </w:t>
       </w:r>
-      <w:hyperlink r:id="rId140">
+      <w:hyperlink r:id="rId138">
         <w:r>
           <w:rPr>
             <w:rStyle w:val="Hyperlink"/>
@@ -14438,8 +13311,8 @@
         </w:r>
       </w:hyperlink>
     </w:p>
-    <w:bookmarkEnd w:id="141"/>
-    <w:bookmarkStart w:id="143" w:name="Xc58e1751a8baa9c5b40200f27b4eda63237e4bf"/>
+    <w:bookmarkEnd w:id="139"/>
+    <w:bookmarkStart w:id="141" w:name="Xc58e1751a8baa9c5b40200f27b4eda63237e4bf"/>
     <w:p>
       <w:pPr>
         <w:pStyle w:val="Bibliography"/>
@@ -14535,7 +13408,7 @@
       <w:r>
         <w:t xml:space="preserve"> </w:t>
       </w:r>
-      <w:hyperlink r:id="rId142">
+      <w:hyperlink r:id="rId140">
         <w:r>
           <w:rPr>
             <w:rStyle w:val="Hyperlink"/>
@@ -14544,8 +13417,8 @@
         </w:r>
       </w:hyperlink>
     </w:p>
-    <w:bookmarkEnd w:id="143"/>
-    <w:bookmarkStart w:id="145" w:name="Xd429f7cbe834ce766df9a1ef8fd0f48db167e9c"/>
+    <w:bookmarkEnd w:id="141"/>
+    <w:bookmarkStart w:id="143" w:name="Xd429f7cbe834ce766df9a1ef8fd0f48db167e9c"/>
     <w:p>
       <w:pPr>
         <w:pStyle w:val="Bibliography"/>
@@ -14581,7 +13454,7 @@
       <w:r>
         <w:t xml:space="preserve"> </w:t>
       </w:r>
-      <w:hyperlink r:id="rId144">
+      <w:hyperlink r:id="rId142">
         <w:r>
           <w:rPr>
             <w:rStyle w:val="Hyperlink"/>
@@ -14590,8 +13463,8 @@
         </w:r>
       </w:hyperlink>
     </w:p>
-    <w:bookmarkEnd w:id="145"/>
-    <w:bookmarkStart w:id="147" w:name="ref-richters2021"/>
+    <w:bookmarkEnd w:id="143"/>
+    <w:bookmarkStart w:id="145" w:name="ref-richters2021"/>
     <w:p>
       <w:pPr>
         <w:pStyle w:val="Bibliography"/>
@@ -14628,7 +13501,7 @@
       <w:r>
         <w:t xml:space="preserve"> </w:t>
       </w:r>
-      <w:hyperlink r:id="rId146">
+      <w:hyperlink r:id="rId144">
         <w:r>
           <w:rPr>
             <w:rStyle w:val="Hyperlink"/>
@@ -14637,8 +13510,8 @@
         </w:r>
       </w:hyperlink>
     </w:p>
-    <w:bookmarkEnd w:id="147"/>
-    <w:bookmarkStart w:id="149" w:name="ref-scholerInflatingDeflatingSelf2014"/>
+    <w:bookmarkEnd w:id="145"/>
+    <w:bookmarkStart w:id="147" w:name="ref-scholerInflatingDeflatingSelf2014"/>
     <w:p>
       <w:pPr>
         <w:pStyle w:val="Bibliography"/>
@@ -14687,7 +13560,7 @@
       <w:r>
         <w:t xml:space="preserve"> </w:t>
       </w:r>
-      <w:hyperlink r:id="rId148">
+      <w:hyperlink r:id="rId146">
         <w:r>
           <w:rPr>
             <w:rStyle w:val="Hyperlink"/>
@@ -14696,8 +13569,8 @@
         </w:r>
       </w:hyperlink>
     </w:p>
-    <w:bookmarkEnd w:id="149"/>
-    <w:bookmarkStart w:id="151" w:name="ref-schuetze2024"/>
+    <w:bookmarkEnd w:id="147"/>
+    <w:bookmarkStart w:id="149" w:name="ref-schuetze2024"/>
     <w:p>
       <w:pPr>
         <w:pStyle w:val="Bibliography"/>
@@ -14721,7 +13594,7 @@
       <w:r>
         <w:t xml:space="preserve"> </w:t>
       </w:r>
-      <w:hyperlink r:id="rId150">
+      <w:hyperlink r:id="rId148">
         <w:r>
           <w:rPr>
             <w:rStyle w:val="Hyperlink"/>
@@ -14730,8 +13603,8 @@
         </w:r>
       </w:hyperlink>
     </w:p>
-    <w:bookmarkEnd w:id="151"/>
-    <w:bookmarkStart w:id="153" w:name="X042f113d08c51fc69362f0e4ead83d6ede9c8e1"/>
+    <w:bookmarkEnd w:id="149"/>
+    <w:bookmarkStart w:id="151" w:name="X042f113d08c51fc69362f0e4ead83d6ede9c8e1"/>
     <w:p>
       <w:pPr>
         <w:pStyle w:val="Bibliography"/>
@@ -14807,7 +13680,7 @@
       <w:r>
         <w:t xml:space="preserve"> </w:t>
       </w:r>
-      <w:hyperlink r:id="rId152">
+      <w:hyperlink r:id="rId150">
         <w:r>
           <w:rPr>
             <w:rStyle w:val="Hyperlink"/>
@@ -14816,8 +13689,8 @@
         </w:r>
       </w:hyperlink>
     </w:p>
-    <w:bookmarkEnd w:id="153"/>
-    <w:bookmarkStart w:id="155" w:name="ref-vuorreAffectiveUpliftVideo2024"/>
+    <w:bookmarkEnd w:id="151"/>
+    <w:bookmarkStart w:id="153" w:name="ref-vuorreAffectiveUpliftVideo2024"/>
     <w:p>
       <w:pPr>
         <w:pStyle w:val="Bibliography"/>
@@ -14859,7 +13732,7 @@
       <w:r>
         <w:t xml:space="preserve"> </w:t>
       </w:r>
-      <w:hyperlink r:id="rId154">
+      <w:hyperlink r:id="rId152">
         <w:r>
           <w:rPr>
             <w:rStyle w:val="Hyperlink"/>
@@ -14868,8 +13741,8 @@
         </w:r>
       </w:hyperlink>
     </w:p>
-    <w:bookmarkEnd w:id="155"/>
-    <w:bookmarkStart w:id="157" w:name="ref-vuorreThreeObjectionsNovel2022"/>
+    <w:bookmarkEnd w:id="153"/>
+    <w:bookmarkStart w:id="155" w:name="ref-vuorreThreeObjectionsNovel2022"/>
     <w:p>
       <w:pPr>
         <w:pStyle w:val="Bibliography"/>
@@ -14893,7 +13766,7 @@
       <w:r>
         <w:t xml:space="preserve"> </w:t>
       </w:r>
-      <w:hyperlink r:id="rId156">
+      <w:hyperlink r:id="rId154">
         <w:r>
           <w:rPr>
             <w:rStyle w:val="Hyperlink"/>
@@ -14902,8 +13775,8 @@
         </w:r>
       </w:hyperlink>
     </w:p>
-    <w:bookmarkEnd w:id="157"/>
-    <w:bookmarkStart w:id="159" w:name="ref-dplyr2023"/>
+    <w:bookmarkEnd w:id="155"/>
+    <w:bookmarkStart w:id="157" w:name="ref-dplyr2023"/>
     <w:p>
       <w:pPr>
         <w:pStyle w:val="Bibliography"/>
@@ -14927,7 +13800,7 @@
       <w:r>
         <w:t xml:space="preserve"> </w:t>
       </w:r>
-      <w:hyperlink r:id="rId158">
+      <w:hyperlink r:id="rId156">
         <w:r>
           <w:rPr>
             <w:rStyle w:val="Hyperlink"/>
@@ -14936,9 +13809,10 @@
         </w:r>
       </w:hyperlink>
     </w:p>
+    <w:bookmarkEnd w:id="157"/>
+    <w:bookmarkEnd w:id="158"/>
     <w:bookmarkEnd w:id="159"/>
     <w:bookmarkEnd w:id="160"/>
-    <w:bookmarkEnd w:id="161"/>
     <w:sectPr>
       <w:pgSz w:h="15840" w:w="12240"/>
       <w:pgMar w:bottom="1440" w:footer="720" w:gutter="0" w:header="720" w:left="1701" w:right="1701" w:top="1440"/>

</xml_diff>